<commit_message>
SSRN paper link is updated
</commit_message>
<xml_diff>
--- a/CV/CV_Dinesh_Poddaturi.docx
+++ b/CV/CV_Dinesh_Poddaturi.docx
@@ -82,6 +82,32 @@
         </w:rPr>
         <w:t xml:space="preserve"> </w:t>
       </w:r>
+      <w:r>
+        <w:rPr>
+          <w:color w:val="000000" w:themeColor="text1"/>
+          <w:sz w:val="18"/>
+          <w:szCs w:val="18"/>
+        </w:rPr>
+        <w:t>|</w:t>
+      </w:r>
+      <w:r>
+        <w:rPr>
+          <w:color w:val="000000" w:themeColor="text1"/>
+          <w:sz w:val="18"/>
+          <w:szCs w:val="18"/>
+        </w:rPr>
+        <w:t xml:space="preserve"> </w:t>
+      </w:r>
+      <w:hyperlink r:id="rId8" w:history="1">
+        <w:r>
+          <w:rPr>
+            <w:rStyle w:val="Hyperlink"/>
+            <w:sz w:val="18"/>
+            <w:szCs w:val="18"/>
+          </w:rPr>
+          <w:t>ssrn.com/abstract=6502262</w:t>
+        </w:r>
+      </w:hyperlink>
     </w:p>
     <w:p>
       <w:pPr>
@@ -961,14 +987,26 @@
         <w:rPr>
           <w:color w:val="000000" w:themeColor="text1"/>
         </w:rPr>
-        <w:t xml:space="preserve">Poddaturi, D.R. (2026). Profit-Aware Pricing in Two-Sided Marketplaces: Demand Elasticity, Cost Uncertainty, and Customer Lifetime Value in Brazilian E-Commerce. Working paper. Available on </w:t>
-      </w:r>
-      <w:hyperlink r:id="rId8" w:history="1">
+        <w:t xml:space="preserve">Poddaturi, D.R. (2026). Profit-Aware Pricing in Two-Sided Marketplaces: Demand Elasticity, Cost Uncertainty, and Customer Lifetime Value in Brazilian E-Commerce. Working paper. Available </w:t>
+      </w:r>
+      <w:r>
+        <w:rPr>
+          <w:color w:val="000000" w:themeColor="text1"/>
+        </w:rPr>
+        <w:t>at</w:t>
+      </w:r>
+      <w:r>
+        <w:rPr>
+          <w:color w:val="000000" w:themeColor="text1"/>
+        </w:rPr>
+        <w:t xml:space="preserve"> </w:t>
+      </w:r>
+      <w:hyperlink r:id="rId9" w:history="1">
         <w:r>
           <w:rPr>
             <w:rStyle w:val="Hyperlink"/>
           </w:rPr>
-          <w:t>my website</w:t>
+          <w:t>SSRN</w:t>
         </w:r>
       </w:hyperlink>
       <w:r>

</xml_diff>

<commit_message>
CV and Resume edited with experimentation instead of A/B Testing
</commit_message>
<xml_diff>
--- a/CV/CV_Dinesh_Poddaturi.docx
+++ b/CV/CV_Dinesh_Poddaturi.docx
@@ -1195,7 +1195,19 @@
         <w:rPr>
           <w:color w:val="000000" w:themeColor="text1"/>
         </w:rPr>
-        <w:t>Demand elasticity estimation, structural econometric modeling, causal inference, discrete choice models, A/B testing, propensity modeling, CLV modeling, counterfactual simulation, panel data methods</w:t>
+        <w:t xml:space="preserve">Demand elasticity estimation, structural econometric modeling, causal inference, discrete choice models, </w:t>
+      </w:r>
+      <w:r>
+        <w:rPr>
+          <w:color w:val="000000" w:themeColor="text1"/>
+        </w:rPr>
+        <w:t>experimentation</w:t>
+      </w:r>
+      <w:r>
+        <w:rPr>
+          <w:color w:val="000000" w:themeColor="text1"/>
+        </w:rPr>
+        <w:t>, propensity modeling, CLV modeling, counterfactual simulation, panel data methods</w:t>
       </w:r>
     </w:p>
     <w:p>

</xml_diff>